<commit_message>
Add redistributable data, availability statements and reproduce script
- Commit public-domain KAPSARC exports, archived GEM wiki pages
  (CC BY-NC-SA) and processed tables with SHA-256 manifests; keep only
  metadata/checksums for three KAPSARC series with no stated licence
- Add data/README.md (sources, licences, what is re-downloaded)
- Add journal-ready data, code and reproducibility statements and
  update the manuscript's availability sections
- Add reproduce.sh, results/SHA256SUMS, requirements-lock.txt and
  CITATION.cff; GEM fleet can be rebuilt from the archive
- Make the gzip result table deterministic; full rerun reproduces all
  28 result files byte-for-byte

Co-Authored-By: Claude Opus 5.5 <noreply@anthropic.com>
Claude-Session: https://claude.ai/code/session_01DRfZzUxiGUjGpyByQFQYgi
</commit_message>
<xml_diff>
--- a/manuscript/manuscript_draft.docx
+++ b/manuscript/manuscript_draft.docx
@@ -2886,7 +2886,25 @@
         <w:pStyle w:val="FirstParagraph"/>
       </w:pPr>
       <w:r>
-        <w:t xml:space="preserve">The KAPSARC datasets are available at datasource.kapsarc.org under the identifiers listed in</w:t>
+        <w:t xml:space="preserve">The data that support the findings of this study are openly available. Regional electricity statistics were obtained from the KAPSARC Energy Data Portal (https://datasource.kapsarc.org; dataset identifiers listed in the repository). Renewable project records were obtained from the Global Energy Monitor wiki (https://www.gem.wiki, CC BY-NC-SA), weather data from NASA POWER (https://power.larc.nasa.gov) and province boundaries from Natural Earth. All data were retrieved on 18 October 2026. Archived source files, checksums, processed data and all result tables are available at https://github.com/mdtabrez-hub/KSA-energy [and Zenodo, https://doi.org/10.5281/zenodo.XXXXXXX]. Three KAPSARC series that state no reuse licence are represented there by metadata and SHA-256 checksums and are re-downloaded by the provided scripts.</w:t>
+      </w:r>
+    </w:p>
+    <w:bookmarkEnd w:id="46"/>
+    <w:bookmarkStart w:id="47" w:name="code-availability"/>
+    <w:p>
+      <w:pPr>
+        <w:pStyle w:val="Heading1"/>
+      </w:pPr>
+      <w:r>
+        <w:t xml:space="preserve">Code availability</w:t>
+      </w:r>
+    </w:p>
+    <w:p>
+      <w:pPr>
+        <w:pStyle w:val="FirstParagraph"/>
+      </w:pPr>
+      <w:r>
+        <w:t xml:space="preserve">All code is available at https://github.com/mdtabrez-hub/KSA-energy (version [commit]) under the MIT licence. It is written in Python 3.13 with pinned dependencies and includes automated tests and a single script,</w:t>
       </w:r>
       <w:r>
         <w:t xml:space="preserve"> </w:t>
@@ -2895,52 +2913,10 @@
         <w:rPr>
           <w:rStyle w:val="VerbatimChar"/>
         </w:rPr>
-        <w:t xml:space="preserve">config/data_sources.yaml</w:t>
-      </w:r>
-      <w:r>
-        <w:t xml:space="preserve">. GEM wiki content (CC BY-NC-SA), Natural Earth and NASA POWER are publicly available. Derived tables are provided in</w:t>
-      </w:r>
-      <w:r>
-        <w:t xml:space="preserve"> </w:t>
-      </w:r>
-      <w:r>
-        <w:rPr>
-          <w:rStyle w:val="VerbatimChar"/>
-        </w:rPr>
-        <w:t xml:space="preserve">results/tables</w:t>
-      </w:r>
-      <w:r>
-        <w:t xml:space="preserve">.</w:t>
-      </w:r>
-    </w:p>
-    <w:bookmarkEnd w:id="46"/>
-    <w:bookmarkStart w:id="47" w:name="code-availability"/>
-    <w:p>
-      <w:pPr>
-        <w:pStyle w:val="Heading1"/>
-      </w:pPr>
-      <w:r>
-        <w:t xml:space="preserve">Code availability</w:t>
-      </w:r>
-    </w:p>
-    <w:p>
-      <w:pPr>
-        <w:pStyle w:val="FirstParagraph"/>
-      </w:pPr>
-      <w:r>
-        <w:t xml:space="preserve">All code, tests and the run order are provided in the accompanying repository (</w:t>
-      </w:r>
-      <w:r>
-        <w:rPr>
-          <w:rStyle w:val="VerbatimChar"/>
-        </w:rPr>
-        <w:t xml:space="preserve">docs/results_phase6_7.md</w:t>
-      </w:r>
-      <w:r>
-        <w:t xml:space="preserve"> </w:t>
-      </w:r>
-      <w:r>
-        <w:t xml:space="preserve">§8).</w:t>
+        <w:t xml:space="preserve">reproduce.sh</w:t>
+      </w:r>
+      <w:r>
+        <w:t xml:space="preserve">, that regenerates every table and figure. Re-running the pipeline from the archived inputs reproduced all result files byte-for-byte.</w:t>
       </w:r>
     </w:p>
     <w:bookmarkEnd w:id="47"/>

</xml_diff>